<commit_message>
Update reports section title and embed exp1 screenshots
</commit_message>
<xml_diff>
--- a/reports/实验三_在原始森林中解救A_实验报告.docx
+++ b/reports/实验三_在原始森林中解救A_实验报告.docx
@@ -1238,12 +1238,12 @@
         <w:pStyle w:val="3"/>
       </w:pPr>
       <w:r>
-        <w:t>八、截图粘贴说明</w:t>
-      </w:r>
-    </w:p>
-    <w:p>
-      <w:r>
-        <w:t>按照指导书要求，建议至少补充以下截图：</w:t>
+        <w:t>八、实验内容</w:t>
+      </w:r>
+    </w:p>
+    <w:p>
+      <w:r>
+        <w:t>按照指导书要求，本节建议补充以下实验内容截图：</w:t>
       </w:r>
     </w:p>
     <w:p>
@@ -1266,7 +1266,7 @@
         <w:jc w:val="center"/>
       </w:pPr>
       <w:r>
-        <w:t>【在此插入截图 1】</w:t>
+        <w:t>【在此插入实验内容截图 1】</w:t>
       </w:r>
     </w:p>
     <w:p>
@@ -1274,7 +1274,7 @@
         <w:jc w:val="center"/>
       </w:pPr>
       <w:r>
-        <w:t>【在此插入截图 2】</w:t>
+        <w:t>【在此插入实验内容截图 2】</w:t>
       </w:r>
     </w:p>
     <w:p>
@@ -1282,7 +1282,7 @@
         <w:jc w:val="center"/>
       </w:pPr>
       <w:r>
-        <w:t>【在此插入截图 3】</w:t>
+        <w:t>【在此插入实验内容截图 3】</w:t>
       </w:r>
     </w:p>
     <w:p>

</xml_diff>

<commit_message>
Embed exp3 screenshots into report
</commit_message>
<xml_diff>
--- a/reports/实验三_在原始森林中解救A_实验报告.docx
+++ b/reports/实验三_在原始森林中解救A_实验报告.docx
@@ -1243,22 +1243,7 @@
     </w:p>
     <w:p>
       <w:r>
-        <w:t>按照指导书要求，本节建议补充以下实验内容截图：</w:t>
-      </w:r>
-    </w:p>
-    <w:p>
-      <w:r>
-        <w:t>1. 截图 1：队列扩展与剪枝逻辑的代码调试截图。</w:t>
-      </w:r>
-    </w:p>
-    <w:p>
-      <w:r>
-        <w:t>2. 截图 2：输入指导书样例后的运行结果截图。</w:t>
-      </w:r>
-    </w:p>
-    <w:p>
-      <w:r>
-        <w:t>3. 截图 3：程序输出 Yes/No 判定结果的截图。</w:t>
+        <w:t>本实验的核心代码截图与运行结果截图如下：</w:t>
       </w:r>
     </w:p>
     <w:p>
@@ -1266,7 +1251,7 @@
         <w:jc w:val="center"/>
       </w:pPr>
       <w:r>
-        <w:t>【在此插入实验内容截图 1】</w:t>
+        <w:t>图 3-1 程序开头与状态结点定义</w:t>
       </w:r>
     </w:p>
     <w:p>
@@ -1274,7 +1259,38 @@
         <w:jc w:val="center"/>
       </w:pPr>
       <w:r>
-        <w:t>【在此插入实验内容截图 2】</w:t>
+        <w:drawing>
+          <wp:inline xmlns:a="http://schemas.openxmlformats.org/drawingml/2006/main" xmlns:pic="http://schemas.openxmlformats.org/drawingml/2006/picture">
+            <wp:extent cx="5669280" cy="3421117"/>
+            <wp:docPr id="8" name="Picture 8"/>
+            <wp:cNvGraphicFramePr>
+              <a:graphicFrameLocks noChangeAspect="1"/>
+            </wp:cNvGraphicFramePr>
+            <a:graphic>
+              <a:graphicData uri="http://schemas.openxmlformats.org/drawingml/2006/picture">
+                <pic:pic>
+                  <pic:nvPicPr>
+                    <pic:cNvPr id="0" name="截屏2026-04-07 09.05.39.png"/>
+                    <pic:cNvPicPr/>
+                  </pic:nvPicPr>
+                  <pic:blipFill>
+                    <a:blip r:embed="rId8"/>
+                    <a:stretch>
+                      <a:fillRect/>
+                    </a:stretch>
+                  </pic:blipFill>
+                  <pic:spPr>
+                    <a:xfrm>
+                      <a:off x="0" y="0"/>
+                      <a:ext cx="5669280" cy="3421117"/>
+                    </a:xfrm>
+                    <a:prstGeom prst="rect"/>
+                  </pic:spPr>
+                </pic:pic>
+              </a:graphicData>
+            </a:graphic>
+          </wp:inline>
+        </w:drawing>
       </w:r>
     </w:p>
     <w:p>
@@ -1282,7 +1298,187 @@
         <w:jc w:val="center"/>
       </w:pPr>
       <w:r>
-        <w:t>【在此插入实验内容截图 3】</w:t>
+        <w:t>图 3-2 活结点队列初始化与 BFS 扩展逻辑</w:t>
+      </w:r>
+    </w:p>
+    <w:p>
+      <w:pPr>
+        <w:jc w:val="center"/>
+      </w:pPr>
+      <w:r>
+        <w:drawing>
+          <wp:inline xmlns:a="http://schemas.openxmlformats.org/drawingml/2006/main" xmlns:pic="http://schemas.openxmlformats.org/drawingml/2006/picture">
+            <wp:extent cx="5669280" cy="3421117"/>
+            <wp:docPr id="9" name="Picture 9"/>
+            <wp:cNvGraphicFramePr>
+              <a:graphicFrameLocks noChangeAspect="1"/>
+            </wp:cNvGraphicFramePr>
+            <a:graphic>
+              <a:graphicData uri="http://schemas.openxmlformats.org/drawingml/2006/picture">
+                <pic:pic>
+                  <pic:nvPicPr>
+                    <pic:cNvPr id="0" name="截屏2026-04-07 09.05.47.png"/>
+                    <pic:cNvPicPr/>
+                  </pic:nvPicPr>
+                  <pic:blipFill>
+                    <a:blip r:embed="rId9"/>
+                    <a:stretch>
+                      <a:fillRect/>
+                    </a:stretch>
+                  </pic:blipFill>
+                  <pic:spPr>
+                    <a:xfrm>
+                      <a:off x="0" y="0"/>
+                      <a:ext cx="5669280" cy="3421117"/>
+                    </a:xfrm>
+                    <a:prstGeom prst="rect"/>
+                  </pic:spPr>
+                </pic:pic>
+              </a:graphicData>
+            </a:graphic>
+          </wp:inline>
+        </w:drawing>
+      </w:r>
+    </w:p>
+    <w:p>
+      <w:pPr>
+        <w:jc w:val="center"/>
+      </w:pPr>
+      <w:r>
+        <w:t>图 3-3 剪枝与最终输出逻辑</w:t>
+      </w:r>
+    </w:p>
+    <w:p>
+      <w:pPr>
+        <w:jc w:val="center"/>
+      </w:pPr>
+      <w:r>
+        <w:drawing>
+          <wp:inline xmlns:a="http://schemas.openxmlformats.org/drawingml/2006/main" xmlns:pic="http://schemas.openxmlformats.org/drawingml/2006/picture">
+            <wp:extent cx="5669280" cy="3421117"/>
+            <wp:docPr id="10" name="Picture 10"/>
+            <wp:cNvGraphicFramePr>
+              <a:graphicFrameLocks noChangeAspect="1"/>
+            </wp:cNvGraphicFramePr>
+            <a:graphic>
+              <a:graphicData uri="http://schemas.openxmlformats.org/drawingml/2006/picture">
+                <pic:pic>
+                  <pic:nvPicPr>
+                    <pic:cNvPr id="0" name="截屏2026-04-07 09.05.49.png"/>
+                    <pic:cNvPicPr/>
+                  </pic:nvPicPr>
+                  <pic:blipFill>
+                    <a:blip r:embed="rId10"/>
+                    <a:stretch>
+                      <a:fillRect/>
+                    </a:stretch>
+                  </pic:blipFill>
+                  <pic:spPr>
+                    <a:xfrm>
+                      <a:off x="0" y="0"/>
+                      <a:ext cx="5669280" cy="3421117"/>
+                    </a:xfrm>
+                    <a:prstGeom prst="rect"/>
+                  </pic:spPr>
+                </pic:pic>
+              </a:graphicData>
+            </a:graphic>
+          </wp:inline>
+        </w:drawing>
+      </w:r>
+    </w:p>
+    <w:p>
+      <w:pPr>
+        <w:jc w:val="center"/>
+      </w:pPr>
+      <w:r>
+        <w:t>图 3-4 实验三测试用例</w:t>
+      </w:r>
+    </w:p>
+    <w:p>
+      <w:pPr>
+        <w:jc w:val="center"/>
+      </w:pPr>
+      <w:r>
+        <w:drawing>
+          <wp:inline xmlns:a="http://schemas.openxmlformats.org/drawingml/2006/main" xmlns:pic="http://schemas.openxmlformats.org/drawingml/2006/picture">
+            <wp:extent cx="5669280" cy="3421117"/>
+            <wp:docPr id="11" name="Picture 11"/>
+            <wp:cNvGraphicFramePr>
+              <a:graphicFrameLocks noChangeAspect="1"/>
+            </wp:cNvGraphicFramePr>
+            <a:graphic>
+              <a:graphicData uri="http://schemas.openxmlformats.org/drawingml/2006/picture">
+                <pic:pic>
+                  <pic:nvPicPr>
+                    <pic:cNvPr id="0" name="截屏2026-04-07 09.06.01.png"/>
+                    <pic:cNvPicPr/>
+                  </pic:nvPicPr>
+                  <pic:blipFill>
+                    <a:blip r:embed="rId11"/>
+                    <a:stretch>
+                      <a:fillRect/>
+                    </a:stretch>
+                  </pic:blipFill>
+                  <pic:spPr>
+                    <a:xfrm>
+                      <a:off x="0" y="0"/>
+                      <a:ext cx="5669280" cy="3421117"/>
+                    </a:xfrm>
+                    <a:prstGeom prst="rect"/>
+                  </pic:spPr>
+                </pic:pic>
+              </a:graphicData>
+            </a:graphic>
+          </wp:inline>
+        </w:drawing>
+      </w:r>
+    </w:p>
+    <w:p>
+      <w:pPr>
+        <w:jc w:val="center"/>
+      </w:pPr>
+      <w:r>
+        <w:t>图 3-5 实验三编译与运行结果</w:t>
+      </w:r>
+    </w:p>
+    <w:p>
+      <w:pPr>
+        <w:jc w:val="center"/>
+      </w:pPr>
+      <w:r>
+        <w:drawing>
+          <wp:inline xmlns:a="http://schemas.openxmlformats.org/drawingml/2006/main" xmlns:pic="http://schemas.openxmlformats.org/drawingml/2006/picture">
+            <wp:extent cx="5669280" cy="3563714"/>
+            <wp:docPr id="12" name="Picture 12"/>
+            <wp:cNvGraphicFramePr>
+              <a:graphicFrameLocks noChangeAspect="1"/>
+            </wp:cNvGraphicFramePr>
+            <a:graphic>
+              <a:graphicData uri="http://schemas.openxmlformats.org/drawingml/2006/picture">
+                <pic:pic>
+                  <pic:nvPicPr>
+                    <pic:cNvPr id="0" name="截屏2026-04-07 09.05.25.png"/>
+                    <pic:cNvPicPr/>
+                  </pic:nvPicPr>
+                  <pic:blipFill>
+                    <a:blip r:embed="rId12"/>
+                    <a:stretch>
+                      <a:fillRect/>
+                    </a:stretch>
+                  </pic:blipFill>
+                  <pic:spPr>
+                    <a:xfrm>
+                      <a:off x="0" y="0"/>
+                      <a:ext cx="5669280" cy="3563714"/>
+                    </a:xfrm>
+                    <a:prstGeom prst="rect"/>
+                  </pic:spPr>
+                </pic:pic>
+              </a:graphicData>
+            </a:graphic>
+          </wp:inline>
+        </w:drawing>
       </w:r>
     </w:p>
     <w:p>

</xml_diff>

<commit_message>
Update finalized lab reports
</commit_message>
<xml_diff>
--- a/reports/实验三_在原始森林中解救A_实验报告.docx
+++ b/reports/实验三_在原始森林中解救A_实验报告.docx
@@ -127,14 +127,6 @@
         <w:gridCol w:w="3092"/>
       </w:tblGrid>
       <w:tr>
-        <w:tblPrEx>
-          <w:tblCellMar>
-            <w:top w:w="0" w:type="dxa"/>
-            <w:left w:w="108" w:type="dxa"/>
-            <w:bottom w:w="0" w:type="dxa"/>
-            <w:right w:w="108" w:type="dxa"/>
-          </w:tblCellMar>
-        </w:tblPrEx>
         <w:tc>
           <w:tcPr>
             <w:tcW w:w="1868" w:type="dxa"/>
@@ -188,14 +180,6 @@
         </w:tc>
       </w:tr>
       <w:tr>
-        <w:tblPrEx>
-          <w:tblCellMar>
-            <w:top w:w="0" w:type="dxa"/>
-            <w:left w:w="108" w:type="dxa"/>
-            <w:bottom w:w="0" w:type="dxa"/>
-            <w:right w:w="108" w:type="dxa"/>
-          </w:tblCellMar>
-        </w:tblPrEx>
         <w:tc>
           <w:tcPr>
             <w:tcW w:w="1868" w:type="dxa"/>
@@ -249,14 +233,6 @@
         </w:tc>
       </w:tr>
       <w:tr>
-        <w:tblPrEx>
-          <w:tblCellMar>
-            <w:top w:w="0" w:type="dxa"/>
-            <w:left w:w="108" w:type="dxa"/>
-            <w:bottom w:w="0" w:type="dxa"/>
-            <w:right w:w="108" w:type="dxa"/>
-          </w:tblCellMar>
-        </w:tblPrEx>
         <w:tc>
           <w:tcPr>
             <w:tcW w:w="1868" w:type="dxa"/>
@@ -337,14 +313,6 @@
         </w:tc>
       </w:tr>
       <w:tr>
-        <w:tblPrEx>
-          <w:tblCellMar>
-            <w:top w:w="0" w:type="dxa"/>
-            <w:left w:w="108" w:type="dxa"/>
-            <w:bottom w:w="0" w:type="dxa"/>
-            <w:right w:w="108" w:type="dxa"/>
-          </w:tblCellMar>
-        </w:tblPrEx>
         <w:tc>
           <w:tcPr>
             <w:tcW w:w="1868" w:type="dxa"/>
@@ -418,14 +386,6 @@
         </w:tc>
       </w:tr>
       <w:tr>
-        <w:tblPrEx>
-          <w:tblCellMar>
-            <w:top w:w="0" w:type="dxa"/>
-            <w:left w:w="108" w:type="dxa"/>
-            <w:bottom w:w="0" w:type="dxa"/>
-            <w:right w:w="108" w:type="dxa"/>
-          </w:tblCellMar>
-        </w:tblPrEx>
         <w:tc>
           <w:tcPr>
             <w:tcW w:w="1868" w:type="dxa"/>
@@ -458,21 +418,27 @@
             <w:vAlign w:val="center"/>
           </w:tcPr>
           <w:p>
+            <w:pPr>
+              <w:rPr>
+                <w:rFonts w:hint="default" w:ascii="Times New Roman" w:hAnsi="Times New Roman" w:cs="Times New Roman" w:eastAsiaTheme="minorEastAsia"/>
+                <w:sz w:val="30"/>
+                <w:szCs w:val="30"/>
+                <w:lang w:val="en-US" w:eastAsia="zh-CN"/>
+              </w:rPr>
+            </w:pPr>
             <w:r>
-              <w:t>待填写</w:t>
+              <w:rPr>
+                <w:rFonts w:hint="eastAsia" w:ascii="Times New Roman" w:hAnsi="Times New Roman" w:cs="Times New Roman"/>
+                <w:sz w:val="30"/>
+                <w:szCs w:val="30"/>
+                <w:lang w:val="en-US" w:eastAsia="zh-CN"/>
+              </w:rPr>
+              <w:t>2315302125</w:t>
             </w:r>
           </w:p>
         </w:tc>
       </w:tr>
       <w:tr>
-        <w:tblPrEx>
-          <w:tblCellMar>
-            <w:top w:w="0" w:type="dxa"/>
-            <w:left w:w="108" w:type="dxa"/>
-            <w:bottom w:w="0" w:type="dxa"/>
-            <w:right w:w="108" w:type="dxa"/>
-          </w:tblCellMar>
-        </w:tblPrEx>
         <w:tc>
           <w:tcPr>
             <w:tcW w:w="1868" w:type="dxa"/>
@@ -505,21 +471,27 @@
             <w:vAlign w:val="center"/>
           </w:tcPr>
           <w:p>
+            <w:pPr>
+              <w:rPr>
+                <w:rFonts w:hint="eastAsia" w:ascii="宋体" w:hAnsi="宋体" w:eastAsia="宋体" w:cs="宋体"/>
+                <w:sz w:val="30"/>
+                <w:szCs w:val="30"/>
+                <w:lang w:val="en-US" w:eastAsia="zh-CN"/>
+              </w:rPr>
+            </w:pPr>
             <w:r>
-              <w:t>待填写</w:t>
+              <w:rPr>
+                <w:rFonts w:hint="eastAsia" w:ascii="宋体" w:hAnsi="宋体" w:eastAsia="宋体" w:cs="宋体"/>
+                <w:sz w:val="30"/>
+                <w:szCs w:val="30"/>
+                <w:lang w:val="en-US" w:eastAsia="zh-CN"/>
+              </w:rPr>
+              <w:t>崔子霖</w:t>
             </w:r>
           </w:p>
         </w:tc>
       </w:tr>
       <w:tr>
-        <w:tblPrEx>
-          <w:tblCellMar>
-            <w:top w:w="0" w:type="dxa"/>
-            <w:left w:w="108" w:type="dxa"/>
-            <w:bottom w:w="0" w:type="dxa"/>
-            <w:right w:w="108" w:type="dxa"/>
-          </w:tblCellMar>
-        </w:tblPrEx>
         <w:tc>
           <w:tcPr>
             <w:tcW w:w="1868" w:type="dxa"/>
@@ -573,14 +545,6 @@
         </w:tc>
       </w:tr>
       <w:tr>
-        <w:tblPrEx>
-          <w:tblCellMar>
-            <w:top w:w="0" w:type="dxa"/>
-            <w:left w:w="108" w:type="dxa"/>
-            <w:bottom w:w="0" w:type="dxa"/>
-            <w:right w:w="108" w:type="dxa"/>
-          </w:tblCellMar>
-        </w:tblPrEx>
         <w:tc>
           <w:tcPr>
             <w:tcW w:w="1868" w:type="dxa"/>
@@ -684,56 +648,31 @@
         </w:rPr>
         <w:t>2026年 4 月</w:t>
       </w:r>
-      <w:bookmarkStart w:id="0" w:name="_GoBack"/>
-      <w:bookmarkEnd w:id="0"/>
-      <w:r>
-        <w:rPr>
-          <w:rFonts w:hint="eastAsia" w:ascii="黑体" w:hAnsi="宋体" w:eastAsia="黑体"/>
-          <w:bCs/>
-          <w:kern w:val="44"/>
-          <w:sz w:val="44"/>
-          <w:szCs w:val="44"/>
-        </w:rPr>
-      </w:r>
-      <w:r>
-        <w:rPr>
-          <w:rFonts w:hint="eastAsia" w:ascii="黑体" w:hAnsi="宋体" w:eastAsia="黑体"/>
-          <w:bCs/>
-          <w:kern w:val="44"/>
+    </w:p>
+    <w:p>
+      <w:pPr>
+        <w:pStyle w:val="3"/>
+        <w:bidi w:val="0"/>
+        <w:jc w:val="center"/>
+        <w:rPr>
+          <w:rFonts w:hint="eastAsia"/>
           <w:sz w:val="44"/>
           <w:szCs w:val="44"/>
           <w:lang w:val="en-US" w:eastAsia="zh-CN"/>
         </w:rPr>
-      </w:r>
-      <w:r>
-        <w:rPr>
-          <w:rFonts w:hint="eastAsia" w:ascii="黑体" w:hAnsi="宋体" w:eastAsia="黑体"/>
-          <w:bCs/>
-          <w:kern w:val="44"/>
+      </w:pPr>
+      <w:bookmarkStart w:id="0" w:name="_GoBack"/>
+      <w:r>
+        <w:rPr>
+          <w:rFonts w:hint="eastAsia"/>
           <w:sz w:val="44"/>
           <w:szCs w:val="44"/>
-        </w:rPr>
-      </w:r>
-      <w:r/>
-    </w:p>
-    <w:p>
-      <w:pPr>
-        <w:pStyle w:val="3"/>
-        <w:bidi w:val="0"/>
-        <w:jc w:val="center"/>
-        <w:rPr>
-          <w:rFonts w:hint="eastAsia"/>
           <w:lang w:val="en-US" w:eastAsia="zh-CN"/>
         </w:rPr>
-      </w:pPr>
-      <w:r>
-        <w:rPr>
-          <w:rFonts w:hint="eastAsia"/>
-          <w:lang w:val="en-US" w:eastAsia="zh-CN"/>
-        </w:rPr>
         <w:t>实验三 在原始森林中解救A</w:t>
       </w:r>
     </w:p>
+    <w:bookmarkEnd w:id="0"/>
     <w:p>
       <w:pPr>
         <w:keepNext w:val="0"/>
@@ -750,20 +689,20 @@
         <w:adjustRightInd/>
         <w:snapToGrid/>
         <w:spacing w:line="360" w:lineRule="auto"/>
-        <w:ind w:firstLine="480" w:firstLineChars="200"/>
+        <w:ind w:firstLine="420" w:firstLineChars="200"/>
         <w:textAlignment w:val="auto"/>
         <w:rPr>
           <w:rFonts w:hint="eastAsia"/>
-          <w:sz w:val="24"/>
-          <w:szCs w:val="24"/>
+          <w:sz w:val="21"/>
+          <w:szCs w:val="21"/>
           <w:lang w:val="en-US" w:eastAsia="zh-CN"/>
         </w:rPr>
       </w:pPr>
       <w:r>
         <w:rPr>
           <w:rFonts w:hint="eastAsia"/>
-          <w:sz w:val="24"/>
-          <w:szCs w:val="24"/>
+          <w:sz w:val="21"/>
+          <w:szCs w:val="21"/>
           <w:lang w:val="en-US" w:eastAsia="zh-CN"/>
         </w:rPr>
         <w:t>编写一个实验程序解决解救问题，A不幸迷失于原始森林中，B要到原始森林中解救她，他每次只能在上、下、左、右4个方向移动一个单元。B知道如果遇到金刚他会死的，野狗也会咬他，而且咬了两次（含一只野狗咬两次或两只野狗各咬一次）之后他也会死的。求B能否找到A。</w:t>
@@ -785,20 +724,20 @@
         <w:adjustRightInd/>
         <w:snapToGrid/>
         <w:spacing w:line="360" w:lineRule="auto"/>
-        <w:ind w:firstLine="480" w:firstLineChars="200"/>
+        <w:ind w:firstLine="420" w:firstLineChars="200"/>
         <w:textAlignment w:val="auto"/>
         <w:rPr>
           <w:rFonts w:hint="eastAsia"/>
-          <w:sz w:val="24"/>
-          <w:szCs w:val="24"/>
+          <w:sz w:val="21"/>
+          <w:szCs w:val="21"/>
           <w:lang w:val="en-US" w:eastAsia="zh-CN"/>
         </w:rPr>
       </w:pPr>
       <w:r>
         <w:rPr>
           <w:rFonts w:hint="eastAsia"/>
-          <w:sz w:val="24"/>
-          <w:szCs w:val="24"/>
+          <w:sz w:val="21"/>
+          <w:szCs w:val="21"/>
           <w:lang w:val="en-US" w:eastAsia="zh-CN"/>
         </w:rPr>
         <w:t>要求：</w:t>
@@ -824,20 +763,20 @@
         <w:adjustRightInd/>
         <w:snapToGrid/>
         <w:spacing w:line="360" w:lineRule="auto"/>
-        <w:ind w:firstLine="480" w:firstLineChars="200"/>
+        <w:ind w:firstLine="420" w:firstLineChars="200"/>
         <w:textAlignment w:val="auto"/>
         <w:rPr>
           <w:rFonts w:hint="eastAsia"/>
-          <w:sz w:val="24"/>
-          <w:szCs w:val="24"/>
+          <w:sz w:val="21"/>
+          <w:szCs w:val="21"/>
           <w:lang w:val="en-US" w:eastAsia="zh-CN"/>
         </w:rPr>
       </w:pPr>
       <w:r>
         <w:rPr>
           <w:rFonts w:hint="eastAsia"/>
-          <w:sz w:val="24"/>
-          <w:szCs w:val="24"/>
+          <w:sz w:val="21"/>
+          <w:szCs w:val="21"/>
           <w:lang w:val="en-US" w:eastAsia="zh-CN"/>
         </w:rPr>
         <w:t>使用C++程序设计语言完成题目。</w:t>
@@ -863,20 +802,20 @@
         <w:adjustRightInd/>
         <w:snapToGrid/>
         <w:spacing w:line="360" w:lineRule="auto"/>
-        <w:ind w:firstLine="480" w:firstLineChars="200"/>
+        <w:ind w:firstLine="420" w:firstLineChars="200"/>
         <w:textAlignment w:val="auto"/>
         <w:rPr>
           <w:rFonts w:hint="eastAsia"/>
-          <w:sz w:val="24"/>
-          <w:szCs w:val="24"/>
+          <w:sz w:val="21"/>
+          <w:szCs w:val="21"/>
           <w:lang w:val="en-US" w:eastAsia="zh-CN"/>
         </w:rPr>
       </w:pPr>
       <w:r>
         <w:rPr>
           <w:rFonts w:hint="eastAsia"/>
-          <w:sz w:val="24"/>
-          <w:szCs w:val="24"/>
+          <w:sz w:val="21"/>
+          <w:szCs w:val="21"/>
           <w:lang w:val="en-US" w:eastAsia="zh-CN"/>
         </w:rPr>
         <w:t>编写完程序后，回答如下问题：</w:t>
@@ -905,16 +844,16 @@
         <w:textAlignment w:val="auto"/>
         <w:rPr>
           <w:rFonts w:hint="default"/>
-          <w:sz w:val="24"/>
-          <w:szCs w:val="24"/>
+          <w:sz w:val="21"/>
+          <w:szCs w:val="21"/>
           <w:lang w:val="en-US" w:eastAsia="zh-CN"/>
         </w:rPr>
       </w:pPr>
       <w:r>
         <w:rPr>
           <w:rFonts w:hint="eastAsia"/>
-          <w:sz w:val="24"/>
-          <w:szCs w:val="24"/>
+          <w:sz w:val="21"/>
+          <w:szCs w:val="21"/>
           <w:lang w:val="en-US" w:eastAsia="zh-CN"/>
         </w:rPr>
         <w:t xml:space="preserve">      （1）请给出队列式分支限界法算法框架。</w:t>
@@ -940,20 +879,20 @@
         <w:adjustRightInd/>
         <w:snapToGrid/>
         <w:spacing w:line="360" w:lineRule="auto"/>
-        <w:ind w:firstLine="720" w:firstLineChars="300"/>
+        <w:ind w:firstLine="630" w:firstLineChars="300"/>
         <w:textAlignment w:val="auto"/>
         <w:rPr>
           <w:rFonts w:hint="eastAsia"/>
-          <w:sz w:val="24"/>
-          <w:szCs w:val="24"/>
+          <w:sz w:val="21"/>
+          <w:szCs w:val="21"/>
           <w:lang w:val="en-US" w:eastAsia="zh-CN"/>
         </w:rPr>
       </w:pPr>
       <w:r>
         <w:rPr>
           <w:rFonts w:hint="eastAsia"/>
-          <w:sz w:val="24"/>
-          <w:szCs w:val="24"/>
+          <w:sz w:val="21"/>
+          <w:szCs w:val="21"/>
           <w:lang w:val="en-US" w:eastAsia="zh-CN"/>
         </w:rPr>
         <w:t>（2）结合本章学习，给出优先队列式分支限界法中队列结点类型声明，并解释类型成员表示的含义。</w:t>
@@ -982,8 +921,8 @@
         <w:textAlignment w:val="auto"/>
         <w:rPr>
           <w:rFonts w:hint="eastAsia"/>
-          <w:sz w:val="24"/>
-          <w:szCs w:val="24"/>
+          <w:sz w:val="21"/>
+          <w:szCs w:val="21"/>
           <w:lang w:val="en-US" w:eastAsia="zh-CN"/>
         </w:rPr>
       </w:pPr>
@@ -1008,20 +947,20 @@
         <w:adjustRightInd/>
         <w:snapToGrid/>
         <w:spacing w:line="360" w:lineRule="auto"/>
-        <w:ind w:firstLine="480" w:firstLineChars="200"/>
+        <w:ind w:firstLine="420" w:firstLineChars="200"/>
         <w:textAlignment w:val="auto"/>
         <w:rPr>
           <w:rFonts w:hint="default"/>
-          <w:sz w:val="24"/>
-          <w:szCs w:val="24"/>
+          <w:sz w:val="21"/>
+          <w:szCs w:val="21"/>
           <w:lang w:val="en-US" w:eastAsia="zh-CN"/>
         </w:rPr>
       </w:pPr>
       <w:r>
         <w:rPr>
           <w:rFonts w:hint="eastAsia"/>
-          <w:sz w:val="24"/>
-          <w:szCs w:val="24"/>
+          <w:sz w:val="21"/>
+          <w:szCs w:val="21"/>
           <w:lang w:val="en-US" w:eastAsia="zh-CN"/>
         </w:rPr>
         <w:t>3、实验报告要求：直接在本文档中续写，要求粘贴代码调试截图和运行结果截图，回答相应问题。</w:t>
@@ -1052,69 +991,92 @@
           <w:lang w:val="en-US" w:eastAsia="zh-CN"/>
         </w:rPr>
       </w:pPr>
-      <w:r>
-        <w:rPr>
-          <w:rFonts w:hint="eastAsia"/>
-          <w:sz w:val="24"/>
-          <w:szCs w:val="24"/>
-          <w:lang w:val="en-US" w:eastAsia="zh-CN"/>
-        </w:rPr>
-      </w:r>
     </w:p>
     <w:p>
       <w:pPr>
         <w:pStyle w:val="3"/>
+        <w:spacing w:line="360" w:lineRule="auto"/>
       </w:pPr>
       <w:r>
         <w:t>四、实验设计与实现</w:t>
       </w:r>
     </w:p>
     <w:p>
+      <w:pPr>
+        <w:spacing w:line="360" w:lineRule="auto"/>
+      </w:pPr>
       <w:r>
         <w:t>1. 算法策略：分支限界法。</w:t>
       </w:r>
     </w:p>
     <w:p>
+      <w:pPr>
+        <w:spacing w:line="360" w:lineRule="auto"/>
+      </w:pPr>
       <w:r>
         <w:t>2. 主要思想：程序把每一个搜索状态定义为“当前位置 + 已被野狗咬的次数”，并使用队列保存所有待扩展的活结点。每次从队首取出一个活结点，向四个方向扩展；如果越界、遇到金刚、被咬次数达到 2 次，或者该状态已访问过，则立即剪枝。只要搜索过程中能够到达 A 的位置，就说明 B 可以成功解救 A。</w:t>
       </w:r>
     </w:p>
     <w:p>
+      <w:pPr>
+        <w:spacing w:line="360" w:lineRule="auto"/>
+      </w:pPr>
       <w:r>
         <w:t>3. 算法框架：</w:t>
       </w:r>
     </w:p>
     <w:p>
+      <w:pPr>
+        <w:spacing w:line="360" w:lineRule="auto"/>
+      </w:pPr>
       <w:r>
         <w:t>1. 初始化活结点队列，将起点状态入队。</w:t>
       </w:r>
     </w:p>
     <w:p>
+      <w:pPr>
+        <w:spacing w:line="360" w:lineRule="auto"/>
+      </w:pPr>
       <w:r>
         <w:t>2. 当队列非空时，取出队首结点作为当前扩展结点。</w:t>
       </w:r>
     </w:p>
     <w:p>
+      <w:pPr>
+        <w:spacing w:line="360" w:lineRule="auto"/>
+      </w:pPr>
       <w:r>
         <w:t>3. 若当前结点已经到达目标位置，则输出 Yes 并结束。</w:t>
       </w:r>
     </w:p>
     <w:p>
+      <w:pPr>
+        <w:spacing w:line="360" w:lineRule="auto"/>
+      </w:pPr>
       <w:r>
         <w:t>4. 按照四个方向生成子结点，并检查约束条件。</w:t>
       </w:r>
     </w:p>
     <w:p>
+      <w:pPr>
+        <w:spacing w:line="360" w:lineRule="auto"/>
+      </w:pPr>
       <w:r>
         <w:t>5. 对满足条件且未访问过的子结点入队；对不满足条件的子结点直接剪枝。</w:t>
       </w:r>
     </w:p>
     <w:p>
+      <w:pPr>
+        <w:spacing w:line="360" w:lineRule="auto"/>
+      </w:pPr>
       <w:r>
         <w:t>6. 若队列为空仍未到达目标，则输出 No。</w:t>
       </w:r>
     </w:p>
     <w:p>
+      <w:pPr>
+        <w:spacing w:line="360" w:lineRule="auto"/>
+      </w:pPr>
       <w:r>
         <w:t>4. 时间复杂度分析：每个位置最多只有两种有效生命状态：未被咬和被咬一次，因此状态总数不超过 2*n*n。每个状态最多向四个方向扩展一次，所以时间复杂度为 O(n^2)，空间复杂度同样为 O(n^2)。</w:t>
       </w:r>
@@ -1122,12 +1084,16 @@
     <w:p>
       <w:pPr>
         <w:pStyle w:val="3"/>
+        <w:spacing w:line="360" w:lineRule="auto"/>
       </w:pPr>
       <w:r>
         <w:t>五、程序实现说明</w:t>
       </w:r>
     </w:p>
     <w:p>
+      <w:pPr>
+        <w:spacing w:line="360" w:lineRule="auto"/>
+      </w:pPr>
       <w:r>
         <w:t>核心程序位于 exp3_rescue_a/src/main.cpp。代码使用 queue 存储活结点，并借助三维 visited[x][y][dogBites] 数组避免重复扩展已经处理过的状态。</w:t>
       </w:r>
@@ -1135,77 +1101,120 @@
     <w:p>
       <w:pPr>
         <w:pStyle w:val="3"/>
+        <w:spacing w:line="360" w:lineRule="auto"/>
       </w:pPr>
       <w:r>
         <w:t>六、问题回答</w:t>
       </w:r>
     </w:p>
     <w:p>
+      <w:pPr>
+        <w:spacing w:line="360" w:lineRule="auto"/>
+      </w:pPr>
       <w:r>
         <w:t>问题（1）：（1）请给出队列式分支限界法算法框架。</w:t>
       </w:r>
     </w:p>
     <w:p>
+      <w:pPr>
+        <w:spacing w:line="360" w:lineRule="auto"/>
+      </w:pPr>
       <w:r>
         <w:t>程序把每一个搜索状态定义为“当前位置 + 已被野狗咬的次数”，并使用队列保存所有待扩展的活结点。每次从队首取出一个活结点，向四个方向扩展；如果越界、遇到金刚、被咬次数达到 2 次，或者该状态已访问过，则立即剪枝。只要搜索过程中能够到达 A 的位置，就说明 B 可以成功解救 A。</w:t>
       </w:r>
     </w:p>
     <w:p>
+      <w:pPr>
+        <w:spacing w:line="360" w:lineRule="auto"/>
+      </w:pPr>
       <w:r>
         <w:t>算法框架如下：</w:t>
       </w:r>
     </w:p>
     <w:p>
+      <w:pPr>
+        <w:spacing w:line="360" w:lineRule="auto"/>
+      </w:pPr>
       <w:r>
         <w:t>1. 初始化活结点队列，将起点状态入队。</w:t>
       </w:r>
     </w:p>
     <w:p>
+      <w:pPr>
+        <w:spacing w:line="360" w:lineRule="auto"/>
+      </w:pPr>
       <w:r>
         <w:t>2. 当队列非空时，取出队首结点作为当前扩展结点。</w:t>
       </w:r>
     </w:p>
     <w:p>
+      <w:pPr>
+        <w:spacing w:line="360" w:lineRule="auto"/>
+      </w:pPr>
       <w:r>
         <w:t>3. 若当前结点已经到达目标位置，则输出 Yes 并结束。</w:t>
       </w:r>
     </w:p>
     <w:p>
+      <w:pPr>
+        <w:spacing w:line="360" w:lineRule="auto"/>
+      </w:pPr>
       <w:r>
         <w:t>4. 按照四个方向生成子结点，并检查约束条件。</w:t>
       </w:r>
     </w:p>
     <w:p>
+      <w:pPr>
+        <w:spacing w:line="360" w:lineRule="auto"/>
+      </w:pPr>
       <w:r>
         <w:t>5. 对满足条件且未访问过的子结点入队；对不满足条件的子结点直接剪枝。</w:t>
       </w:r>
     </w:p>
     <w:p>
+      <w:pPr>
+        <w:spacing w:line="360" w:lineRule="auto"/>
+      </w:pPr>
       <w:r>
         <w:t>6. 若队列为空仍未到达目标，则输出 No。</w:t>
       </w:r>
     </w:p>
     <w:p>
+      <w:pPr>
+        <w:spacing w:line="360" w:lineRule="auto"/>
+      </w:pPr>
       <w:r>
         <w:t>问题（2）：（2）结合本章学习，给出优先队列式分支限界法中队列结点类型声明，并解释类型成员表示的含义。</w:t>
       </w:r>
     </w:p>
     <w:p>
+      <w:pPr>
+        <w:spacing w:line="360" w:lineRule="auto"/>
+      </w:pPr>
       <w:r>
         <w:t>每个位置最多只有两种有效生命状态：未被咬和被咬一次，因此状态总数不超过 2*n*n。每个状态最多向四个方向扩展一次，所以时间复杂度为 O(n^2)，空间复杂度同样为 O(n^2)。</w:t>
       </w:r>
     </w:p>
     <w:p>
+      <w:pPr>
+        <w:spacing w:line="360" w:lineRule="auto"/>
+      </w:pPr>
       <w:r>
         <w:t>优先队列式分支限界法结点类型示例</w:t>
       </w:r>
     </w:p>
     <w:p>
+      <w:pPr>
+        <w:spacing w:line="360" w:lineRule="auto"/>
+      </w:pPr>
       <w:r>
         <w:t>可以定义结点类型为：struct Node { int x; int y; int dogBites; int depth; int bound; };</w:t>
       </w:r>
     </w:p>
     <w:p>
+      <w:pPr>
+        <w:spacing w:line="360" w:lineRule="auto"/>
+      </w:pPr>
       <w:r>
         <w:t>其中 x、y 表示当前所在位置坐标；dogBites 表示当前已经被野狗咬的次数；depth 表示从起点走到当前结点所经过的步数；bound 表示该结点的界，可以用估计代价或优先级函数表示，用于决定优先队列中的扩展次序。</w:t>
       </w:r>
@@ -1213,22 +1222,32 @@
     <w:p>
       <w:pPr>
         <w:pStyle w:val="3"/>
+        <w:spacing w:line="360" w:lineRule="auto"/>
       </w:pPr>
       <w:r>
         <w:t>七、测试结果与分析</w:t>
       </w:r>
     </w:p>
     <w:p>
+      <w:pPr>
+        <w:spacing w:line="360" w:lineRule="auto"/>
+      </w:pPr>
       <w:r>
         <w:t>1. 对指导书中的两组样例数据进行测试，程序分别输出 Yes 和 No，与样例答案一致。</w:t>
       </w:r>
     </w:p>
     <w:p>
+      <w:pPr>
+        <w:spacing w:line="360" w:lineRule="auto"/>
+      </w:pPr>
       <w:r>
         <w:t>2. 程序的剪枝条件包括：越界、进入金刚位置、累计狗咬次数达到 2、以及重复状态。</w:t>
       </w:r>
     </w:p>
     <w:p>
+      <w:pPr>
+        <w:spacing w:line="360" w:lineRule="auto"/>
+      </w:pPr>
       <w:r>
         <w:t>3. 从运行结果可以看出，该方法能够有效判断是否存在安全可行路径。</w:t>
       </w:r>
@@ -1236,18 +1255,23 @@
     <w:p>
       <w:pPr>
         <w:pStyle w:val="3"/>
+        <w:spacing w:line="360" w:lineRule="auto"/>
       </w:pPr>
       <w:r>
         <w:t>八、实验内容</w:t>
       </w:r>
     </w:p>
     <w:p>
+      <w:pPr>
+        <w:spacing w:line="360" w:lineRule="auto"/>
+      </w:pPr>
       <w:r>
         <w:t>本实验的核心代码截图与运行结果截图如下：</w:t>
       </w:r>
     </w:p>
     <w:p>
       <w:pPr>
+        <w:spacing w:line="360" w:lineRule="auto"/>
         <w:jc w:val="center"/>
       </w:pPr>
       <w:r>
@@ -1256,22 +1280,188 @@
     </w:p>
     <w:p>
       <w:pPr>
+        <w:spacing w:line="360" w:lineRule="auto"/>
         <w:jc w:val="center"/>
       </w:pPr>
       <w:r>
         <w:drawing>
-          <wp:inline xmlns:a="http://schemas.openxmlformats.org/drawingml/2006/main" xmlns:pic="http://schemas.openxmlformats.org/drawingml/2006/picture">
-            <wp:extent cx="5669280" cy="3421117"/>
+          <wp:inline distT="0" distB="0" distL="114300" distR="114300">
+            <wp:extent cx="5669280" cy="3420745"/>
+            <wp:effectExtent l="0" t="0" r="20320" b="8255"/>
             <wp:docPr id="8" name="Picture 8"/>
             <wp:cNvGraphicFramePr>
-              <a:graphicFrameLocks noChangeAspect="1"/>
+              <a:graphicFrameLocks xmlns:a="http://schemas.openxmlformats.org/drawingml/2006/main" noChangeAspect="1"/>
             </wp:cNvGraphicFramePr>
-            <a:graphic>
+            <a:graphic xmlns:a="http://schemas.openxmlformats.org/drawingml/2006/main">
               <a:graphicData uri="http://schemas.openxmlformats.org/drawingml/2006/picture">
-                <pic:pic>
+                <pic:pic xmlns:pic="http://schemas.openxmlformats.org/drawingml/2006/picture">
                   <pic:nvPicPr>
-                    <pic:cNvPr id="0" name="截屏2026-04-07 09.05.39.png"/>
-                    <pic:cNvPicPr/>
+                    <pic:cNvPr id="8" name="Picture 8"/>
+                    <pic:cNvPicPr>
+                      <a:picLocks noChangeAspect="1"/>
+                    </pic:cNvPicPr>
+                  </pic:nvPicPr>
+                  <pic:blipFill>
+                    <a:blip r:embed="rId5"/>
+                    <a:stretch>
+                      <a:fillRect/>
+                    </a:stretch>
+                  </pic:blipFill>
+                  <pic:spPr>
+                    <a:xfrm>
+                      <a:off x="0" y="0"/>
+                      <a:ext cx="5669280" cy="3421117"/>
+                    </a:xfrm>
+                    <a:prstGeom prst="rect">
+                      <a:avLst/>
+                    </a:prstGeom>
+                  </pic:spPr>
+                </pic:pic>
+              </a:graphicData>
+            </a:graphic>
+          </wp:inline>
+        </w:drawing>
+      </w:r>
+    </w:p>
+    <w:p>
+      <w:pPr>
+        <w:spacing w:line="360" w:lineRule="auto"/>
+        <w:jc w:val="center"/>
+      </w:pPr>
+      <w:r>
+        <w:t>图 3-2 活结点队列初始化与 BFS 扩展逻辑</w:t>
+      </w:r>
+    </w:p>
+    <w:p>
+      <w:pPr>
+        <w:spacing w:line="360" w:lineRule="auto"/>
+        <w:jc w:val="center"/>
+      </w:pPr>
+      <w:r>
+        <w:drawing>
+          <wp:inline distT="0" distB="0" distL="114300" distR="114300">
+            <wp:extent cx="5669280" cy="3420745"/>
+            <wp:effectExtent l="0" t="0" r="20320" b="8255"/>
+            <wp:docPr id="9" name="Picture 9"/>
+            <wp:cNvGraphicFramePr>
+              <a:graphicFrameLocks xmlns:a="http://schemas.openxmlformats.org/drawingml/2006/main" noChangeAspect="1"/>
+            </wp:cNvGraphicFramePr>
+            <a:graphic xmlns:a="http://schemas.openxmlformats.org/drawingml/2006/main">
+              <a:graphicData uri="http://schemas.openxmlformats.org/drawingml/2006/picture">
+                <pic:pic xmlns:pic="http://schemas.openxmlformats.org/drawingml/2006/picture">
+                  <pic:nvPicPr>
+                    <pic:cNvPr id="9" name="Picture 9"/>
+                    <pic:cNvPicPr>
+                      <a:picLocks noChangeAspect="1"/>
+                    </pic:cNvPicPr>
+                  </pic:nvPicPr>
+                  <pic:blipFill>
+                    <a:blip r:embed="rId6"/>
+                    <a:stretch>
+                      <a:fillRect/>
+                    </a:stretch>
+                  </pic:blipFill>
+                  <pic:spPr>
+                    <a:xfrm>
+                      <a:off x="0" y="0"/>
+                      <a:ext cx="5669280" cy="3421117"/>
+                    </a:xfrm>
+                    <a:prstGeom prst="rect">
+                      <a:avLst/>
+                    </a:prstGeom>
+                  </pic:spPr>
+                </pic:pic>
+              </a:graphicData>
+            </a:graphic>
+          </wp:inline>
+        </w:drawing>
+      </w:r>
+    </w:p>
+    <w:p>
+      <w:pPr>
+        <w:spacing w:line="360" w:lineRule="auto"/>
+        <w:jc w:val="center"/>
+      </w:pPr>
+      <w:r>
+        <w:t>图 3-3 剪枝与最终输出逻辑</w:t>
+      </w:r>
+    </w:p>
+    <w:p>
+      <w:pPr>
+        <w:spacing w:line="360" w:lineRule="auto"/>
+        <w:jc w:val="center"/>
+      </w:pPr>
+      <w:r>
+        <w:drawing>
+          <wp:inline distT="0" distB="0" distL="114300" distR="114300">
+            <wp:extent cx="5669280" cy="3420745"/>
+            <wp:effectExtent l="0" t="0" r="20320" b="8255"/>
+            <wp:docPr id="10" name="Picture 10"/>
+            <wp:cNvGraphicFramePr>
+              <a:graphicFrameLocks xmlns:a="http://schemas.openxmlformats.org/drawingml/2006/main" noChangeAspect="1"/>
+            </wp:cNvGraphicFramePr>
+            <a:graphic xmlns:a="http://schemas.openxmlformats.org/drawingml/2006/main">
+              <a:graphicData uri="http://schemas.openxmlformats.org/drawingml/2006/picture">
+                <pic:pic xmlns:pic="http://schemas.openxmlformats.org/drawingml/2006/picture">
+                  <pic:nvPicPr>
+                    <pic:cNvPr id="10" name="Picture 10"/>
+                    <pic:cNvPicPr>
+                      <a:picLocks noChangeAspect="1"/>
+                    </pic:cNvPicPr>
+                  </pic:nvPicPr>
+                  <pic:blipFill>
+                    <a:blip r:embed="rId7"/>
+                    <a:stretch>
+                      <a:fillRect/>
+                    </a:stretch>
+                  </pic:blipFill>
+                  <pic:spPr>
+                    <a:xfrm>
+                      <a:off x="0" y="0"/>
+                      <a:ext cx="5669280" cy="3421117"/>
+                    </a:xfrm>
+                    <a:prstGeom prst="rect">
+                      <a:avLst/>
+                    </a:prstGeom>
+                  </pic:spPr>
+                </pic:pic>
+              </a:graphicData>
+            </a:graphic>
+          </wp:inline>
+        </w:drawing>
+      </w:r>
+    </w:p>
+    <w:p>
+      <w:pPr>
+        <w:spacing w:line="360" w:lineRule="auto"/>
+        <w:jc w:val="center"/>
+      </w:pPr>
+      <w:r>
+        <w:t>图 3-4 实验三测试用例</w:t>
+      </w:r>
+    </w:p>
+    <w:p>
+      <w:pPr>
+        <w:spacing w:line="360" w:lineRule="auto"/>
+        <w:jc w:val="center"/>
+      </w:pPr>
+      <w:r>
+        <w:drawing>
+          <wp:inline distT="0" distB="0" distL="114300" distR="114300">
+            <wp:extent cx="5669280" cy="3420745"/>
+            <wp:effectExtent l="0" t="0" r="20320" b="8255"/>
+            <wp:docPr id="11" name="Picture 11"/>
+            <wp:cNvGraphicFramePr>
+              <a:graphicFrameLocks xmlns:a="http://schemas.openxmlformats.org/drawingml/2006/main" noChangeAspect="1"/>
+            </wp:cNvGraphicFramePr>
+            <a:graphic xmlns:a="http://schemas.openxmlformats.org/drawingml/2006/main">
+              <a:graphicData uri="http://schemas.openxmlformats.org/drawingml/2006/picture">
+                <pic:pic xmlns:pic="http://schemas.openxmlformats.org/drawingml/2006/picture">
+                  <pic:nvPicPr>
+                    <pic:cNvPr id="11" name="Picture 11"/>
+                    <pic:cNvPicPr>
+                      <a:picLocks noChangeAspect="1"/>
+                    </pic:cNvPicPr>
                   </pic:nvPicPr>
                   <pic:blipFill>
                     <a:blip r:embed="rId8"/>
@@ -1284,7 +1474,9 @@
                       <a:off x="0" y="0"/>
                       <a:ext cx="5669280" cy="3421117"/>
                     </a:xfrm>
-                    <a:prstGeom prst="rect"/>
+                    <a:prstGeom prst="rect">
+                      <a:avLst/>
+                    </a:prstGeom>
                   </pic:spPr>
                 </pic:pic>
               </a:graphicData>
@@ -1295,30 +1487,35 @@
     </w:p>
     <w:p>
       <w:pPr>
+        <w:spacing w:line="360" w:lineRule="auto"/>
         <w:jc w:val="center"/>
       </w:pPr>
       <w:r>
-        <w:t>图 3-2 活结点队列初始化与 BFS 扩展逻辑</w:t>
-      </w:r>
-    </w:p>
-    <w:p>
-      <w:pPr>
+        <w:t>图 3-5 实验三编译与运行结果</w:t>
+      </w:r>
+    </w:p>
+    <w:p>
+      <w:pPr>
+        <w:spacing w:line="360" w:lineRule="auto"/>
         <w:jc w:val="center"/>
       </w:pPr>
       <w:r>
         <w:drawing>
-          <wp:inline xmlns:a="http://schemas.openxmlformats.org/drawingml/2006/main" xmlns:pic="http://schemas.openxmlformats.org/drawingml/2006/picture">
-            <wp:extent cx="5669280" cy="3421117"/>
-            <wp:docPr id="9" name="Picture 9"/>
+          <wp:inline distT="0" distB="0" distL="114300" distR="114300">
+            <wp:extent cx="5669280" cy="3563620"/>
+            <wp:effectExtent l="0" t="0" r="0" b="0"/>
+            <wp:docPr id="12" name="Picture 12"/>
             <wp:cNvGraphicFramePr>
-              <a:graphicFrameLocks noChangeAspect="1"/>
+              <a:graphicFrameLocks xmlns:a="http://schemas.openxmlformats.org/drawingml/2006/main" noChangeAspect="1"/>
             </wp:cNvGraphicFramePr>
-            <a:graphic>
+            <a:graphic xmlns:a="http://schemas.openxmlformats.org/drawingml/2006/main">
               <a:graphicData uri="http://schemas.openxmlformats.org/drawingml/2006/picture">
-                <pic:pic>
+                <pic:pic xmlns:pic="http://schemas.openxmlformats.org/drawingml/2006/picture">
                   <pic:nvPicPr>
-                    <pic:cNvPr id="0" name="截屏2026-04-07 09.05.47.png"/>
-                    <pic:cNvPicPr/>
+                    <pic:cNvPr id="12" name="Picture 12"/>
+                    <pic:cNvPicPr>
+                      <a:picLocks noChangeAspect="1"/>
+                    </pic:cNvPicPr>
                   </pic:nvPicPr>
                   <pic:blipFill>
                     <a:blip r:embed="rId9"/>
@@ -1329,9 +1526,11 @@
                   <pic:spPr>
                     <a:xfrm>
                       <a:off x="0" y="0"/>
-                      <a:ext cx="5669280" cy="3421117"/>
+                      <a:ext cx="5669280" cy="3563714"/>
                     </a:xfrm>
-                    <a:prstGeom prst="rect"/>
+                    <a:prstGeom prst="rect">
+                      <a:avLst/>
+                    </a:prstGeom>
                   </pic:spPr>
                 </pic:pic>
               </a:graphicData>
@@ -1342,154 +1541,17 @@
     </w:p>
     <w:p>
       <w:pPr>
-        <w:jc w:val="center"/>
-      </w:pPr>
-      <w:r>
-        <w:t>图 3-3 剪枝与最终输出逻辑</w:t>
-      </w:r>
-    </w:p>
-    <w:p>
-      <w:pPr>
-        <w:jc w:val="center"/>
-      </w:pPr>
-      <w:r>
-        <w:drawing>
-          <wp:inline xmlns:a="http://schemas.openxmlformats.org/drawingml/2006/main" xmlns:pic="http://schemas.openxmlformats.org/drawingml/2006/picture">
-            <wp:extent cx="5669280" cy="3421117"/>
-            <wp:docPr id="10" name="Picture 10"/>
-            <wp:cNvGraphicFramePr>
-              <a:graphicFrameLocks noChangeAspect="1"/>
-            </wp:cNvGraphicFramePr>
-            <a:graphic>
-              <a:graphicData uri="http://schemas.openxmlformats.org/drawingml/2006/picture">
-                <pic:pic>
-                  <pic:nvPicPr>
-                    <pic:cNvPr id="0" name="截屏2026-04-07 09.05.49.png"/>
-                    <pic:cNvPicPr/>
-                  </pic:nvPicPr>
-                  <pic:blipFill>
-                    <a:blip r:embed="rId10"/>
-                    <a:stretch>
-                      <a:fillRect/>
-                    </a:stretch>
-                  </pic:blipFill>
-                  <pic:spPr>
-                    <a:xfrm>
-                      <a:off x="0" y="0"/>
-                      <a:ext cx="5669280" cy="3421117"/>
-                    </a:xfrm>
-                    <a:prstGeom prst="rect"/>
-                  </pic:spPr>
-                </pic:pic>
-              </a:graphicData>
-            </a:graphic>
-          </wp:inline>
-        </w:drawing>
-      </w:r>
-    </w:p>
-    <w:p>
-      <w:pPr>
-        <w:jc w:val="center"/>
-      </w:pPr>
-      <w:r>
-        <w:t>图 3-4 实验三测试用例</w:t>
-      </w:r>
-    </w:p>
-    <w:p>
-      <w:pPr>
-        <w:jc w:val="center"/>
-      </w:pPr>
-      <w:r>
-        <w:drawing>
-          <wp:inline xmlns:a="http://schemas.openxmlformats.org/drawingml/2006/main" xmlns:pic="http://schemas.openxmlformats.org/drawingml/2006/picture">
-            <wp:extent cx="5669280" cy="3421117"/>
-            <wp:docPr id="11" name="Picture 11"/>
-            <wp:cNvGraphicFramePr>
-              <a:graphicFrameLocks noChangeAspect="1"/>
-            </wp:cNvGraphicFramePr>
-            <a:graphic>
-              <a:graphicData uri="http://schemas.openxmlformats.org/drawingml/2006/picture">
-                <pic:pic>
-                  <pic:nvPicPr>
-                    <pic:cNvPr id="0" name="截屏2026-04-07 09.06.01.png"/>
-                    <pic:cNvPicPr/>
-                  </pic:nvPicPr>
-                  <pic:blipFill>
-                    <a:blip r:embed="rId11"/>
-                    <a:stretch>
-                      <a:fillRect/>
-                    </a:stretch>
-                  </pic:blipFill>
-                  <pic:spPr>
-                    <a:xfrm>
-                      <a:off x="0" y="0"/>
-                      <a:ext cx="5669280" cy="3421117"/>
-                    </a:xfrm>
-                    <a:prstGeom prst="rect"/>
-                  </pic:spPr>
-                </pic:pic>
-              </a:graphicData>
-            </a:graphic>
-          </wp:inline>
-        </w:drawing>
-      </w:r>
-    </w:p>
-    <w:p>
-      <w:pPr>
-        <w:jc w:val="center"/>
-      </w:pPr>
-      <w:r>
-        <w:t>图 3-5 实验三编译与运行结果</w:t>
-      </w:r>
-    </w:p>
-    <w:p>
-      <w:pPr>
-        <w:jc w:val="center"/>
-      </w:pPr>
-      <w:r>
-        <w:drawing>
-          <wp:inline xmlns:a="http://schemas.openxmlformats.org/drawingml/2006/main" xmlns:pic="http://schemas.openxmlformats.org/drawingml/2006/picture">
-            <wp:extent cx="5669280" cy="3563714"/>
-            <wp:docPr id="12" name="Picture 12"/>
-            <wp:cNvGraphicFramePr>
-              <a:graphicFrameLocks noChangeAspect="1"/>
-            </wp:cNvGraphicFramePr>
-            <a:graphic>
-              <a:graphicData uri="http://schemas.openxmlformats.org/drawingml/2006/picture">
-                <pic:pic>
-                  <pic:nvPicPr>
-                    <pic:cNvPr id="0" name="截屏2026-04-07 09.05.25.png"/>
-                    <pic:cNvPicPr/>
-                  </pic:nvPicPr>
-                  <pic:blipFill>
-                    <a:blip r:embed="rId12"/>
-                    <a:stretch>
-                      <a:fillRect/>
-                    </a:stretch>
-                  </pic:blipFill>
-                  <pic:spPr>
-                    <a:xfrm>
-                      <a:off x="0" y="0"/>
-                      <a:ext cx="5669280" cy="3563714"/>
-                    </a:xfrm>
-                    <a:prstGeom prst="rect"/>
-                  </pic:spPr>
-                </pic:pic>
-              </a:graphicData>
-            </a:graphic>
-          </wp:inline>
-        </w:drawing>
-      </w:r>
-    </w:p>
-    <w:p>
-      <w:pPr>
         <w:pStyle w:val="3"/>
+        <w:spacing w:line="360" w:lineRule="auto"/>
       </w:pPr>
       <w:r>
         <w:t>九、实验总结</w:t>
       </w:r>
     </w:p>
     <w:p>
+      <w:pPr>
+        <w:spacing w:line="360" w:lineRule="auto"/>
+      </w:pPr>
       <w:r>
         <w:t>通过本实验，掌握了分支限界法中“活结点、扩展结点、剪枝约束”的基本概念，并理解了如何把路径问题转化为带状态约束的图搜索问题。</w:t>
       </w:r>
@@ -2106,21 +2168,4 @@
   </a:themeElements>
   <a:objectDefaults/>
 </a:theme>
-</file>
-
-<file path=customXml/item1.xml><?xml version="1.0" encoding="utf-8"?>
-<s:customData xmlns="http://www.wps.cn/officeDocument/2013/wpsCustomData" xmlns:s="http://www.wps.cn/officeDocument/2013/wpsCustomData">
-  <customSectProps/>
-  <customShpExts>
-    <customShpInfo spid="_x0000_s1026"/>
-  </customShpExts>
-</s:customData>
-</file>
-
-<file path=customXml/itemProps1.xml><?xml version="1.0" encoding="utf-8"?>
-<ds:datastoreItem xmlns:ds="http://schemas.openxmlformats.org/officeDocument/2006/customXml" ds:itemID="{B1977F7D-205B-4081-913C-38D41E755F92}">
-  <ds:schemaRefs>
-    <ds:schemaRef ds:uri="http://www.wps.cn/officeDocument/2013/wpsCustomData"/>
-  </ds:schemaRefs>
-</ds:datastoreItem>
 </file>
</xml_diff>